<commit_message>
feat: complete clinic workflows and demo documentation
</commit_message>
<xml_diff>
--- a/docs/use-cases/MEMS-GC-Actor-and-Use-Case-Catalog.docx
+++ b/docs/use-cases/MEMS-GC-Actor-and-Use-Case-Catalog.docx
@@ -70,7 +70,7 @@
     </w:p>
     <w:p>
       <w:r>
-        <w:t>The inventory contains 71 registered page routes and 314 application endpoint mappings across 41 controllers. The catalog has 125 unique use-case IDs and 194 explicit actor-to-use-case associations. Shared IDs are counted once. Inherited account relations are not added again to that association total. Supporting endpoints, rejected operations and legacy APIs are individually classified in endpoint-inventory.md.</w:t>
+        <w:t>The inventory contains 70 registered page routes and 312 application endpoint mappings across 41 controllers. The catalog has 124 current unique use-case IDs and 192 explicit actor-to-use-case associations. Shared IDs are counted once. Inherited account relations are not added again to that association total. Supporting endpoints, rejected operations and legacy APIs are individually classified in endpoint-inventory.md; removed ID RC-11 remains reserved in old-to-new.md.</w:t>
       </w:r>
     </w:p>
     <w:p>
@@ -1279,16 +1279,8 @@
             <w:vAlign w:val="center"/>
           </w:tcPr>
           <w:p>
-            <w:pPr>
-              <w:spacing w:after="80" w:before="80" w:line="247" w:lineRule="auto"/>
-            </w:pPr>
-            <w:r>
-              <w:rPr>
-                <w:rFonts w:ascii="Arial" w:hAnsi="Arial"/>
-                <w:b w:val="0"/>
-                <w:sz w:val="19"/>
-              </w:rPr>
-              <w:t>16</w:t>
+            <w:r>
+              <w:t>15</w:t>
             </w:r>
           </w:p>
         </w:tc>
@@ -1298,16 +1290,8 @@
             <w:vAlign w:val="center"/>
           </w:tcPr>
           <w:p>
-            <w:pPr>
-              <w:spacing w:after="80" w:before="80" w:line="247" w:lineRule="auto"/>
-            </w:pPr>
-            <w:r>
-              <w:rPr>
-                <w:rFonts w:ascii="Arial" w:hAnsi="Arial"/>
-                <w:b w:val="0"/>
-                <w:sz w:val="19"/>
-              </w:rPr>
-              <w:t>RU‑07, RU‑08, RC‑01, RC‑02, RC‑03, RC‑04, RC‑05, RC‑06, RC‑07, RC‑08, RC‑10, RC‑11, RC‑12, RC‑14, RC‑15, CM‑06</w:t>
+            <w:r>
+              <w:t>RU‑07, RU‑08, RC‑01, RC‑02, RC‑03, RC‑04, RC‑05, RC‑06, RC‑07, RC‑08, RC‑10, RC‑12, RC‑14, RC‑15, CM‑06</w:t>
             </w:r>
           </w:p>
         </w:tc>
@@ -1527,16 +1511,8 @@
             <w:vAlign w:val="center"/>
           </w:tcPr>
           <w:p>
-            <w:pPr>
-              <w:spacing w:after="80" w:before="80" w:line="247" w:lineRule="auto"/>
-            </w:pPr>
-            <w:r>
-              <w:rPr>
-                <w:rFonts w:ascii="Arial" w:hAnsi="Arial"/>
-                <w:b w:val="0"/>
-                <w:sz w:val="19"/>
-              </w:rPr>
-              <w:t>48</w:t>
+            <w:r>
+              <w:t>47</w:t>
             </w:r>
           </w:p>
         </w:tc>
@@ -1546,16 +1522,8 @@
             <w:vAlign w:val="center"/>
           </w:tcPr>
           <w:p>
-            <w:pPr>
-              <w:spacing w:after="80" w:before="80" w:line="247" w:lineRule="auto"/>
-            </w:pPr>
-            <w:r>
-              <w:rPr>
-                <w:rFonts w:ascii="Arial" w:hAnsi="Arial"/>
-                <w:b w:val="0"/>
-                <w:sz w:val="19"/>
-              </w:rPr>
-              <w:t>RU‑07, RU‑08, RC‑01, RC‑02, RC‑03, RC‑04, RC‑05, RC‑06, RC‑07, RC‑08, RC‑10, RC‑11, RC‑12, RC‑13, RC‑14, RC‑15, CA‑01, CA‑02, CA‑03, CA‑04, CA‑05, CA‑06, CA‑07, CA‑08, CA‑09, CA‑10, CA‑11, CA‑12, CM‑01, CM‑02, CM‑03, CM‑04, CM‑05, CM‑06, CM‑08, CM‑09, CM‑10, CM‑11, CM‑12, CM‑13, AD‑01, AD‑02, AD‑03, AD‑06, AD‑07, AD‑09, AD‑10, AD‑11</w:t>
+            <w:r>
+              <w:t>RU‑07, RU‑08, RC‑01, RC‑02, RC‑03, RC‑04, RC‑05, RC‑06, RC‑07, RC‑08, RC‑10, RC‑12, RC‑13, RC‑14, RC‑15, CA‑01, CA‑02, CA‑03, CA‑04, CA‑05, CA‑06, CA‑07, CA‑08, CA‑09, CA‑10, CA‑11, CA‑12, CM‑01, CM‑02, CM‑03, CM‑04, CM‑05, CM‑06, CM‑08, CM‑09, CM‑10, CM‑11, CM‑12, CM‑13, AD‑01, AD‑02, AD‑03, AD‑06, AD‑07, AD‑09, AD‑10, AD‑11</w:t>
             </w:r>
           </w:p>
         </w:tc>
@@ -5209,72 +5177,6 @@
                 <w:sz w:val="19"/>
               </w:rPr>
               <w:t>Review pending same-day return requests and confirm the patient is present. The backend rechecks the ticket and restores WAITING or BLOCKED as the workflow permits; expired requests cannot be confirmed.</w:t>
-              <w:br/>
-              <w:t>Actors: Receptionist, Clinic Manager.</w:t>
-              <w:br/>
-              <w:t>Delivery: UI + backend.</w:t>
-            </w:r>
-          </w:p>
-        </w:tc>
-      </w:tr>
-      <w:tr>
-        <w:trPr>
-          <w:cantSplit/>
-        </w:trPr>
-        <w:tc>
-          <w:tcPr>
-            <w:tcW w:type="dxa" w:w="835"/>
-            <w:vAlign w:val="center"/>
-          </w:tcPr>
-          <w:p>
-            <w:pPr>
-              <w:spacing w:after="80" w:before="80" w:line="247" w:lineRule="auto"/>
-            </w:pPr>
-            <w:r>
-              <w:rPr>
-                <w:rFonts w:ascii="Arial" w:hAnsi="Arial"/>
-                <w:b w:val="0"/>
-                <w:sz w:val="19"/>
-              </w:rPr>
-              <w:t>RC-11</w:t>
-            </w:r>
-          </w:p>
-        </w:tc>
-        <w:tc>
-          <w:tcPr>
-            <w:tcW w:type="dxa" w:w="2275"/>
-            <w:vAlign w:val="center"/>
-          </w:tcPr>
-          <w:p>
-            <w:pPr>
-              <w:spacing w:after="80" w:before="80" w:line="247" w:lineRule="auto"/>
-            </w:pPr>
-            <w:r>
-              <w:rPr>
-                <w:rFonts w:ascii="Arial" w:hAnsi="Arial"/>
-                <w:b w:val="0"/>
-                <w:sz w:val="19"/>
-              </w:rPr>
-              <w:t>Schedule Requested Follow-up</w:t>
-            </w:r>
-          </w:p>
-        </w:tc>
-        <w:tc>
-          <w:tcPr>
-            <w:tcW w:type="dxa" w:w="7114"/>
-            <w:vAlign w:val="center"/>
-          </w:tcPr>
-          <w:p>
-            <w:pPr>
-              <w:spacing w:after="80" w:before="80" w:line="247" w:lineRule="auto"/>
-            </w:pPr>
-            <w:r>
-              <w:rPr>
-                <w:rFonts w:ascii="Arial" w:hAnsi="Arial"/>
-                <w:b w:val="0"/>
-                <w:sz w:val="19"/>
-              </w:rPr>
-              <w:t>Find a pending follow-up recommendation, select the appointment date and shift, and create the follow-up booking. Existing scheduled follow-ups are not treated as unset requests.</w:t>
               <w:br/>
               <w:t>Actors: Receptionist, Clinic Manager.</w:t>
               <w:br/>
@@ -11301,7 +11203,7 @@
         <w:keepLines/>
       </w:pPr>
       <w:r>
-        <w:t>The current examination dialog can directly create a follow-up appointment; it coexists with reception follow-up scheduling. This is not cross-specialty referral. The old recommendation-only description is insufficient; the current direct payload and service checks need separate review as recorded in audit-findings.md.</w:t>
+        <w:t>The Doctor creates the follow-up appointment directly from the examination record. Receptionist support begins only after an appointment exists and uses the ordinary appointment-management workflow; there is no separate reception queue for unscheduled follow-up recommendations. This is not cross-specialty referral.</w:t>
       </w:r>
     </w:p>
     <w:p>

</xml_diff>